<commit_message>
docs: regenera INFORME_FINAL.docx con integrantes y operador DoS completos
Co-Authored-By: Claude Sonnet 4.6 <noreply@anthropic.com>
</commit_message>
<xml_diff>
--- a/reports/INFORME_FINAL.docx
+++ b/reports/INFORME_FINAL.docx
@@ -122,21 +122,6 @@
         <w:spacing w:after="80"/>
       </w:pPr>
     </w:p>
-    <w:p>
-      <w:pPr>
-        <w:spacing w:before="40" w:after="40"/>
-        <w:ind w:left="567" w:right="567"/>
-        <w:shd w:val="clear" w:color="auto" w:fill="FFF3CD"/>
-      </w:pPr>
-      <w:r>
-        <w:rPr>
-          <w:b/>
-          <w:color w:val="856604"/>
-          <w:sz w:val="20"/>
-        </w:rPr>
-        <w:t>⚠ Completar con los datos del equipo.</w:t>
-      </w:r>
-    </w:p>
     <w:tbl>
       <w:tblPr>
         <w:tblStyle w:val="TableGrid"/>
@@ -235,7 +220,7 @@
               <w:rPr>
                 <w:sz w:val="19"/>
               </w:rPr>
-              <w:t>_________________________</w:t>
+              <w:t>Gerardo Antonio Ovando Hernandez</w:t>
             </w:r>
           </w:p>
         </w:tc>
@@ -253,7 +238,7 @@
               <w:rPr>
                 <w:sz w:val="19"/>
               </w:rPr>
-              <w:t>__________</w:t>
+              <w:t>9490-21-7</w:t>
             </w:r>
           </w:p>
         </w:tc>
@@ -292,7 +277,7 @@
               <w:rPr>
                 <w:sz w:val="19"/>
               </w:rPr>
-              <w:t>_________________________</w:t>
+              <w:t>Nancy Noemy Mazariegos Morataya</w:t>
             </w:r>
           </w:p>
         </w:tc>
@@ -311,7 +296,7 @@
               <w:rPr>
                 <w:sz w:val="19"/>
               </w:rPr>
-              <w:t>__________</w:t>
+              <w:t>9490-22-2692</w:t>
             </w:r>
           </w:p>
         </w:tc>
@@ -350,7 +335,7 @@
               <w:rPr>
                 <w:sz w:val="19"/>
               </w:rPr>
-              <w:t>_________________________</w:t>
+              <w:t>Samuel Estuardo España Son</w:t>
             </w:r>
           </w:p>
         </w:tc>
@@ -368,7 +353,7 @@
               <w:rPr>
                 <w:sz w:val="19"/>
               </w:rPr>
-              <w:t>__________</w:t>
+              <w:t>9490-22-11789</w:t>
             </w:r>
           </w:p>
         </w:tc>
@@ -407,7 +392,7 @@
               <w:rPr>
                 <w:sz w:val="19"/>
               </w:rPr>
-              <w:t>_________________________</w:t>
+              <w:t>Wendy Celeste Nathaly Estrada González</w:t>
             </w:r>
           </w:p>
         </w:tc>
@@ -426,7 +411,7 @@
               <w:rPr>
                 <w:sz w:val="19"/>
               </w:rPr>
-              <w:t>__________</w:t>
+              <w:t>9490-22-3630</w:t>
             </w:r>
           </w:p>
         </w:tc>
@@ -465,7 +450,7 @@
               <w:rPr>
                 <w:sz w:val="19"/>
               </w:rPr>
-              <w:t>_________________________</w:t>
+              <w:t>Diego Antonio Beteta Garcia</w:t>
             </w:r>
           </w:p>
         </w:tc>
@@ -483,7 +468,7 @@
               <w:rPr>
                 <w:sz w:val="19"/>
               </w:rPr>
-              <w:t>__________</w:t>
+              <w:t>9490-22-12878</w:t>
             </w:r>
           </w:p>
         </w:tc>
@@ -7496,7 +7481,7 @@
         <w:rPr>
           <w:sz w:val="21"/>
         </w:rPr>
-        <w:t xml:space="preserve"> _________________________</w:t>
+        <w:t xml:space="preserve"> Samuel Estuardo España Son</w:t>
       </w:r>
     </w:p>
     <w:p>
@@ -11756,7 +11741,7 @@
           <w:color w:val="1A1A1A"/>
           <w:sz w:val="17"/>
         </w:rPr>
-        <w:t>Operador:                 _____________________ (completar)</w:t>
+        <w:t>Operador:                 Samuel Estuardo España Son</w:t>
       </w:r>
     </w:p>
     <w:p>
@@ -11921,7 +11906,7 @@
           <w:color w:val="1A1A1A"/>
           <w:sz w:val="17"/>
         </w:rPr>
-        <w:t>Detección por Blue Team:  [ completar: Sí / No / Parcial ]</w:t>
+        <w:t>Detección por Blue Team:  No (entorno académico aislado, sin IDS activo)</w:t>
       </w:r>
     </w:p>
     <w:p>

</xml_diff>